<commit_message>
Anonymize corpus figures (structure-only); add Zenodo/citation metadata
Regenerate Figures 5-8 without source prose for consistency with the
structure-only corpus; remove legacy text-bearing renders; add .zenodo.json,
CITATION.cff and ZENODO.md for DOI archival.
</commit_message>
<xml_diff>
--- a/TCIH-Chat_ESWA_manuscript.docx
+++ b/TCIH-Chat_ESWA_manuscript.docx
@@ -31797,7 +31797,7 @@
       <w:r>
         <w:drawing>
           <wp:inline>
-            <wp:extent cx="5334000" cy="1471584"/>
+            <wp:extent cx="5334000" cy="1483420"/>
             <wp:effectExtent b="0" l="0" r="0" t="0"/>
             <wp:docPr descr="Figure 5. Arithmetic — multi-source aggregation. The total-cost step is a multi-source event (\wedge=2) drawing value-dependency edges (solid blue) from the item-cost steps, while the per-item steps root at the hypothesis (dashed grey). This is the structure the legacy parser misrepresented as a sequential chain." title="" id="81" name="Picture"/>
             <a:graphic>
@@ -31818,7 +31818,7 @@
                   <pic:spPr bwMode="auto">
                     <a:xfrm>
                       <a:off x="0" y="0"/>
-                      <a:ext cx="5334000" cy="1471584"/>
+                      <a:ext cx="5334000" cy="1483420"/>
                     </a:xfrm>
                     <a:prstGeom prst="rect">
                       <a:avLst/>
@@ -31882,7 +31882,7 @@
       <w:r>
         <w:drawing>
           <wp:inline>
-            <wp:extent cx="5334000" cy="2108724"/>
+            <wp:extent cx="5334000" cy="2125685"/>
             <wp:effectExtent b="0" l="0" r="0" t="0"/>
             <wp:docPr descr="Figure 6. Algebra — a short computational chain, with value dependencies linking each result to the step that consumes it." title="" id="84" name="Picture"/>
             <a:graphic>
@@ -31903,7 +31903,7 @@
                   <pic:spPr bwMode="auto">
                     <a:xfrm>
                       <a:off x="0" y="0"/>
-                      <a:ext cx="5334000" cy="2108724"/>
+                      <a:ext cx="5334000" cy="2125685"/>
                     </a:xfrm>
                     <a:prstGeom prst="rect">
                       <a:avLst/>
@@ -31947,7 +31947,7 @@
       <w:r>
         <w:drawing>
           <wp:inline>
-            <wp:extent cx="5334000" cy="979124"/>
+            <wp:extent cx="5334000" cy="986999"/>
             <wp:effectExtent b="0" l="0" r="0" t="0"/>
             <wp:docPr descr="Figure 7. Calculus / analysis — a deeper proof in which several steps carry genuine value dependencies rather than mere sequential adjacency." title="" id="87" name="Picture"/>
             <a:graphic>
@@ -31968,7 +31968,7 @@
                   <pic:spPr bwMode="auto">
                     <a:xfrm>
                       <a:off x="0" y="0"/>
-                      <a:ext cx="5334000" cy="979124"/>
+                      <a:ext cx="5334000" cy="986999"/>
                     </a:xfrm>
                     <a:prstGeom prst="rect">
                       <a:avLst/>
@@ -32012,7 +32012,7 @@
       <w:r>
         <w:drawing>
           <wp:inline>
-            <wp:extent cx="5334000" cy="2108724"/>
+            <wp:extent cx="5334000" cy="2125685"/>
             <wp:effectExtent b="0" l="0" r="0" t="0"/>
             <wp:docPr descr="Figure 8. Propositional logic — parallel derivations rooted at the hypothesis; the legacy parser (§8.8) chained these sequentially, whereas the upgraded parser attaches each to the hypothesis it actually depends on." title="" id="90" name="Picture"/>
             <a:graphic>
@@ -32033,7 +32033,7 @@
                   <pic:spPr bwMode="auto">
                     <a:xfrm>
                       <a:off x="0" y="0"/>
-                      <a:ext cx="5334000" cy="2108724"/>
+                      <a:ext cx="5334000" cy="2125685"/>
                     </a:xfrm>
                     <a:prstGeom prst="rect">
                       <a:avLst/>

</xml_diff>

<commit_message>
Drop Zenodo/DOI; cite GitHub release v1.0.0 as the version of record
</commit_message>
<xml_diff>
--- a/TCIH-Chat_ESWA_manuscript.docx
+++ b/TCIH-Chat_ESWA_manuscript.docx
@@ -18364,7 +18364,19 @@
         <w:t xml:space="preserve">artifacts/corpus_eval.json</w:t>
       </w:r>
       <w:r>
-        <w:t xml:space="preserve">. For archival reproducibility the released commit should be tagged, deposited (e.g. Zenodo) with a DOI, and accompanied by the Python version and a dependency lock; the data-and-code-availability statement (end of paper) is written to be consistent with that artefact, removing the contradiction noted in review.</w:t>
+        <w:t xml:space="preserve">. For reproducibility the released commit is tagged (release</w:t>
+      </w:r>
+      <w:r>
+        <w:t xml:space="preserve"> </w:t>
+      </w:r>
+      <w:r>
+        <w:rPr>
+          <w:rStyle w:val="VerbatimChar"/>
+        </w:rPr>
+        <w:t xml:space="preserve">v1.0.0</w:t>
+      </w:r>
+      <w:r>
+        <w:t xml:space="preserve">) and accompanied by the Python version and a dependency lock; the data-and-code-availability statement (end of paper) is written to be consistent with that artefact, removing the contradiction noted in review.</w:t>
       </w:r>
     </w:p>
     <w:bookmarkEnd w:id="48"/>
@@ -29527,7 +29539,23 @@
         <w:t xml:space="preserve">corpus_full_structure_only.tar.gz</w:t>
       </w:r>
       <w:r>
-        <w:t xml:space="preserve">); this suffices to reproduce the structural results (Tables 10–13). Reproducing the semantic-oracle results (Tables 14–16) additionally requires the original solution text, available from the authors on request under the source licence. Datasets D1–D3 are generated by the released code. A tagged release archived on Zenodo with a citable DOI will accompany the final version and is the artefact of record. This statement supersedes any earlier statement.</w:t>
+        <w:t xml:space="preserve">); this suffices to reproduce the structural results (Tables 10–13). Reproducing the semantic-oracle results (Tables 14–16) additionally requires the original solution text, available from the authors on request under the source licence. Datasets D1–D3 are generated by the released code. The tagged release</w:t>
+      </w:r>
+      <w:r>
+        <w:t xml:space="preserve"> </w:t>
+      </w:r>
+      <w:r>
+        <w:rPr>
+          <w:b/>
+          <w:bCs/>
+        </w:rPr>
+        <w:t xml:space="preserve">v1.0.0</w:t>
+      </w:r>
+      <w:r>
+        <w:t xml:space="preserve"> </w:t>
+      </w:r>
+      <w:r>
+        <w:t xml:space="preserve">of the repository above — with the full structure-only corpus attached as a release asset — is the version of record for the results reported here. This statement supersedes any earlier statement.</w:t>
       </w:r>
     </w:p>
     <w:p>

</xml_diff>

<commit_message>
State D4 corpus provenance: in-house corpus assembled by the authors
</commit_message>
<xml_diff>
--- a/TCIH-Chat_ESWA_manuscript.docx
+++ b/TCIH-Chat_ESWA_manuscript.docx
@@ -18719,7 +18719,46 @@
         <w:t xml:space="preserve"> </w:t>
       </w:r>
       <w:r>
-        <w:t xml:space="preserve">A pipeline (</w:t>
+        <w:t xml:space="preserve">An</w:t>
+      </w:r>
+      <w:r>
+        <w:t xml:space="preserve"> </w:t>
+      </w:r>
+      <w:r>
+        <w:rPr>
+          <w:b/>
+          <w:bCs/>
+        </w:rPr>
+        <w:t xml:space="preserve">in-house corpus assembled by the authors</w:t>
+      </w:r>
+      <w:r>
+        <w:t xml:space="preserve"> </w:t>
+      </w:r>
+      <w:r>
+        <w:t xml:space="preserve">—</w:t>
+      </w:r>
+      <w:r>
+        <w:t xml:space="preserve"> </w:t>
+      </w:r>
+      <m:oMath>
+        <m:r>
+          <m:t>211</m:t>
+        </m:r>
+        <m:r>
+          <m:rPr>
+            <m:sty m:val="p"/>
+          </m:rPr>
+          <m:t>,</m:t>
+        </m:r>
+        <m:r>
+          <m:t>922</m:t>
+        </m:r>
+      </m:oMath>
+      <w:r>
+        <w:t xml:space="preserve"> </w:t>
+      </w:r>
+      <w:r>
+        <w:t xml:space="preserve">step-structured solutions across algebra, number theory, geometry, calculus, and probability/combinatorics — is ingested by a pipeline (</w:t>
       </w:r>
       <w:r>
         <w:rPr>
@@ -18728,30 +18767,7 @@
         <w:t xml:space="preserve">proof_graph_parser.py</w:t>
       </w:r>
       <w:r>
-        <w:t xml:space="preserve">) ingests</w:t>
-      </w:r>
-      <w:r>
-        <w:t xml:space="preserve"> </w:t>
-      </w:r>
-      <m:oMath>
-        <m:r>
-          <m:t>211</m:t>
-        </m:r>
-        <m:r>
-          <m:rPr>
-            <m:sty m:val="p"/>
-          </m:rPr>
-          <m:t>,</m:t>
-        </m:r>
-        <m:r>
-          <m:t>922</m:t>
-        </m:r>
-      </m:oMath>
-      <w:r>
-        <w:t xml:space="preserve"> </w:t>
-      </w:r>
-      <w:r>
-        <w:t xml:space="preserve">step-structured solutions across algebra, number theory, geometry, calculus, and probability/combinatorics into two-level proof graphs, giving the structural statistics that motivate the design (node counts, arities).</w:t>
+        <w:t xml:space="preserve">) into two-level proof graphs, giving the structural statistics that motivate the design (node counts, arities). The corpus was compiled by the authors; its public release is structure-only (Data-availability statement).</w:t>
       </w:r>
     </w:p>
     <w:p>
@@ -23609,7 +23625,7 @@
         <w:pStyle w:val="FirstParagraph"/>
       </w:pPr>
       <w:r>
-        <w:t xml:space="preserve">The ingestion pipeline converts</w:t>
+        <w:t xml:space="preserve">The ingestion pipeline converts the authors’ in-house corpus of</w:t>
       </w:r>
       <w:r>
         <w:t xml:space="preserve"> </w:t>
@@ -23632,7 +23648,7 @@
         <w:t xml:space="preserve"> </w:t>
       </w:r>
       <w:r>
-        <w:t xml:space="preserve">real step-structured solutions into two-level proof graphs totalling</w:t>
+        <w:t xml:space="preserve">step-structured solutions — compiled by the authors across the domains of Table 10 — into two-level proof graphs totalling</w:t>
       </w:r>
       <w:r>
         <w:t xml:space="preserve"> </w:t>
@@ -23696,7 +23712,7 @@
         <w:t xml:space="preserve"> </w:t>
       </w:r>
       <w:r>
-        <w:t xml:space="preserve">rule-nodes, across the domains of Table 10.</w:t>
+        <w:t xml:space="preserve">rule-nodes.</w:t>
       </w:r>
     </w:p>
     <w:tbl>

</xml_diff>